<commit_message>
Add abstract, rename Ch3 Methodology and Ch5 Conclusion, line height 1.25, page numbers centred in footer
</commit_message>
<xml_diff>
--- a/MS499_Term_Paper.docx
+++ b/MS499_Term_Paper.docx
@@ -4,25 +4,25 @@
   <w:body>
     <w:p>
       <w:pPr>
-        <w:spacing w:line="317" w:lineRule="auto" w:before="0" w:after="200"/>
+        <w:spacing w:line="300" w:lineRule="auto" w:before="0" w:after="200"/>
         <w:jc w:val="left"/>
       </w:pPr>
     </w:p>
     <w:p>
       <w:pPr>
-        <w:spacing w:line="317" w:lineRule="auto" w:before="0" w:after="200"/>
+        <w:spacing w:line="300" w:lineRule="auto" w:before="0" w:after="200"/>
         <w:jc w:val="left"/>
       </w:pPr>
     </w:p>
     <w:p>
       <w:pPr>
-        <w:spacing w:line="317" w:lineRule="auto" w:before="0" w:after="200"/>
+        <w:spacing w:line="300" w:lineRule="auto" w:before="0" w:after="200"/>
         <w:jc w:val="left"/>
       </w:pPr>
     </w:p>
     <w:p>
       <w:pPr>
-        <w:spacing w:line="317" w:lineRule="auto" w:before="0" w:after="120"/>
+        <w:spacing w:line="300" w:lineRule="auto" w:before="0" w:after="120"/>
         <w:jc w:val="center"/>
       </w:pPr>
       <w:r>
@@ -37,7 +37,7 @@
     </w:p>
     <w:p>
       <w:pPr>
-        <w:spacing w:line="317" w:lineRule="auto" w:before="0" w:after="480"/>
+        <w:spacing w:line="300" w:lineRule="auto" w:before="0" w:after="480"/>
         <w:jc w:val="center"/>
       </w:pPr>
       <w:r>
@@ -52,7 +52,7 @@
     </w:p>
     <w:p>
       <w:pPr>
-        <w:spacing w:line="317" w:lineRule="auto" w:before="0" w:after="80"/>
+        <w:spacing w:line="300" w:lineRule="auto" w:before="0" w:after="80"/>
         <w:jc w:val="center"/>
       </w:pPr>
       <w:r>
@@ -67,7 +67,7 @@
     </w:p>
     <w:p>
       <w:pPr>
-        <w:spacing w:line="317" w:lineRule="auto" w:before="0" w:after="560"/>
+        <w:spacing w:line="300" w:lineRule="auto" w:before="0" w:after="560"/>
         <w:jc w:val="center"/>
       </w:pPr>
       <w:r>
@@ -82,7 +82,7 @@
     </w:p>
     <w:p>
       <w:pPr>
-        <w:spacing w:line="317" w:lineRule="auto" w:before="0" w:after="80"/>
+        <w:spacing w:line="300" w:lineRule="auto" w:before="0" w:after="80"/>
         <w:jc w:val="center"/>
       </w:pPr>
       <w:r>
@@ -97,7 +97,7 @@
     </w:p>
     <w:p>
       <w:pPr>
-        <w:spacing w:line="317" w:lineRule="auto" w:before="0" w:after="80"/>
+        <w:spacing w:line="300" w:lineRule="auto" w:before="0" w:after="80"/>
         <w:jc w:val="center"/>
       </w:pPr>
       <w:r>
@@ -112,7 +112,7 @@
     </w:p>
     <w:p>
       <w:pPr>
-        <w:spacing w:line="317" w:lineRule="auto" w:before="0" w:after="560"/>
+        <w:spacing w:line="300" w:lineRule="auto" w:before="0" w:after="560"/>
         <w:jc w:val="center"/>
       </w:pPr>
       <w:r>
@@ -127,7 +127,7 @@
     </w:p>
     <w:p>
       <w:pPr>
-        <w:spacing w:line="317" w:lineRule="auto" w:before="0" w:after="80"/>
+        <w:spacing w:line="300" w:lineRule="auto" w:before="0" w:after="80"/>
         <w:jc w:val="center"/>
       </w:pPr>
       <w:r>
@@ -142,7 +142,7 @@
     </w:p>
     <w:p>
       <w:pPr>
-        <w:spacing w:line="317" w:lineRule="auto" w:before="0" w:after="80"/>
+        <w:spacing w:line="300" w:lineRule="auto" w:before="0" w:after="80"/>
         <w:jc w:val="center"/>
       </w:pPr>
       <w:r>
@@ -157,7 +157,7 @@
     </w:p>
     <w:p>
       <w:pPr>
-        <w:spacing w:line="317" w:lineRule="auto" w:before="0" w:after="80"/>
+        <w:spacing w:line="300" w:lineRule="auto" w:before="0" w:after="80"/>
         <w:jc w:val="center"/>
       </w:pPr>
       <w:r>
@@ -172,7 +172,7 @@
     </w:p>
     <w:p>
       <w:pPr>
-        <w:spacing w:line="317" w:lineRule="auto" w:before="0" w:after="560"/>
+        <w:spacing w:line="300" w:lineRule="auto" w:before="0" w:after="560"/>
         <w:jc w:val="center"/>
       </w:pPr>
       <w:r>
@@ -187,7 +187,7 @@
     </w:p>
     <w:p>
       <w:pPr>
-        <w:spacing w:line="317" w:lineRule="auto" w:before="0" w:after="120"/>
+        <w:spacing w:line="300" w:lineRule="auto" w:before="0" w:after="120"/>
         <w:jc w:val="center"/>
       </w:pPr>
       <w:r>
@@ -202,7 +202,7 @@
     </w:p>
     <w:p>
       <w:pPr>
-        <w:spacing w:line="317" w:lineRule="auto" w:before="0" w:after="120"/>
+        <w:spacing w:line="300" w:lineRule="auto" w:before="0" w:after="120"/>
         <w:jc w:val="center"/>
       </w:pPr>
       <w:r>
@@ -217,7 +217,7 @@
     </w:p>
     <w:p>
       <w:pPr>
-        <w:spacing w:line="317" w:lineRule="auto" w:before="0" w:after="200"/>
+        <w:spacing w:line="300" w:lineRule="auto" w:before="0" w:after="200"/>
         <w:jc w:val="center"/>
       </w:pPr>
       <w:r>
@@ -237,7 +237,60 @@
     </w:p>
     <w:p>
       <w:pPr>
-        <w:spacing w:line="276" w:lineRule="auto" w:before="0" w:after="120"/>
+        <w:spacing w:line="300" w:lineRule="auto" w:before="0" w:after="240"/>
+        <w:jc w:val="center"/>
+      </w:pPr>
+      <w:r>
+        <w:rPr>
+          <w:rFonts w:ascii="Times New Roman" w:hAnsi="Times New Roman"/>
+          <w:b/>
+          <w:i w:val="0"/>
+          <w:sz w:val="24"/>
+        </w:rPr>
+        <w:t>ABSTRACT</w:t>
+      </w:r>
+    </w:p>
+    <w:p>
+      <w:pPr>
+        <w:spacing w:line="300" w:lineRule="auto" w:before="0" w:after="200"/>
+        <w:jc w:val="both"/>
+      </w:pPr>
+      <w:r>
+        <w:rPr>
+          <w:rFonts w:ascii="Times New Roman" w:hAnsi="Times New Roman"/>
+          <w:b w:val="0"/>
+          <w:i w:val="0"/>
+          <w:sz w:val="24"/>
+        </w:rPr>
+        <w:t>This study analyses the marketing system of marine fish in Chattogram, Bangladesh, the country's principal coastal fish trading hub, in order to establish how the consumer's taka is divided between the fisher and the intermediaries who stand between him and the market. Data were drawn from a cross-sectional survey of 120 respondents, comprising 30 aratdars, 30 beparis or farias, 30 khuchra retailers and 30 exit-intercepted consumers, across six markets and ten commercially important marine fish species in March 2026. Marketing cost was normalised to the kilogram for every stratum, the retail price was anchored on the prices consumers actually paid, and the resulting chain was required to satisfy three internal consistency identities that are verified automatically at the end of every analysis run. The producer's share of the consumer's taka is 72.4 per cent, against a price spread of BDT 251.34 per kg, or 27.6 per cent. Segment margins are BDT 29.94, BDT 104.87 and BDT 116.53 per kg for the aratdar, bepari or faria and retailer segments, so 88.1 per cent of the spread is created downstream of the landing rather than at it. Deducting the BDT 136.19 per kg of chain marketing cost reduces the gross margin of 27.6 per cent to a net margin of 12.7 per cent, and both the consumer-referenced and the producer-referenced marketing efficiency ratios exceed unity at 2.346 and 1.697. Prices of the same species differ significantly across markets for five of the six species tested, with every significant pairwise contrast falling along a landing-to-periphery axis, but the variation that determines the producer's position is by species rather than by market. The evidence does not support the view that the arat is the principal site of extraction in this chain. Because the analysed workbook is a synthetic realisation of the design rather than collected field data, these figures demonstrate the pipeline and may not be cited as empirical findings.</w:t>
+      </w:r>
+    </w:p>
+    <w:p>
+      <w:pPr>
+        <w:spacing w:line="300" w:lineRule="auto" w:before="0" w:after="240"/>
+        <w:jc w:val="both"/>
+      </w:pPr>
+      <w:r>
+        <w:rPr>
+          <w:rFonts w:ascii="Times New Roman" w:hAnsi="Times New Roman"/>
+          <w:b w:val="0"/>
+          <w:i/>
+          <w:sz w:val="22"/>
+        </w:rPr>
+        <w:t>Keywords: marine fish marketing; marketing margin; price spread; producer's share; marketing efficiency; Chattogram; Bangladesh</w:t>
+      </w:r>
+    </w:p>
+    <w:p>
+      <w:pPr>
+        <w:spacing w:line="240" w:lineRule="auto" w:after="0"/>
+      </w:pPr>
+      <w:r>
+        <w:br w:type="page"/>
+      </w:r>
+    </w:p>
+    <w:p>
+      <w:pPr>
+        <w:spacing w:line="300" w:lineRule="auto" w:before="0" w:after="120"/>
         <w:jc w:val="center"/>
       </w:pPr>
       <w:r>
@@ -252,7 +305,7 @@
     </w:p>
     <w:p>
       <w:pPr>
-        <w:spacing w:line="276" w:lineRule="auto" w:before="0" w:after="120"/>
+        <w:spacing w:line="300" w:lineRule="auto" w:before="0" w:after="120"/>
         <w:jc w:val="center"/>
       </w:pPr>
       <w:r>
@@ -267,7 +320,7 @@
     </w:p>
     <w:p>
       <w:pPr>
-        <w:spacing w:line="317" w:lineRule="auto" w:before="0" w:after="200"/>
+        <w:spacing w:line="300" w:lineRule="auto" w:before="0" w:after="200"/>
         <w:jc w:val="left"/>
       </w:pPr>
     </w:p>
@@ -281,7 +334,7 @@
     </w:p>
     <w:p>
       <w:pPr>
-        <w:spacing w:line="317" w:lineRule="auto" w:before="0" w:after="200"/>
+        <w:spacing w:line="300" w:lineRule="auto" w:before="0" w:after="200"/>
         <w:jc w:val="left"/>
       </w:pPr>
       <w:r>
@@ -296,7 +349,7 @@
     </w:p>
     <w:p>
       <w:pPr>
-        <w:spacing w:line="317" w:lineRule="auto" w:before="0" w:after="200"/>
+        <w:spacing w:line="300" w:lineRule="auto" w:before="0" w:after="200"/>
         <w:jc w:val="left"/>
       </w:pPr>
       <w:r>
@@ -311,7 +364,7 @@
     </w:p>
     <w:p>
       <w:pPr>
-        <w:spacing w:line="317" w:lineRule="auto" w:before="0" w:after="200"/>
+        <w:spacing w:line="300" w:lineRule="auto" w:before="0" w:after="200"/>
         <w:jc w:val="left"/>
       </w:pPr>
       <w:r>
@@ -326,7 +379,7 @@
     </w:p>
     <w:p>
       <w:pPr>
-        <w:spacing w:line="317" w:lineRule="auto" w:before="0" w:after="200"/>
+        <w:spacing w:line="300" w:lineRule="auto" w:before="0" w:after="200"/>
         <w:jc w:val="left"/>
       </w:pPr>
       <w:r>
@@ -341,7 +394,7 @@
     </w:p>
     <w:p>
       <w:pPr>
-        <w:spacing w:line="317" w:lineRule="auto" w:before="0" w:after="200"/>
+        <w:spacing w:line="300" w:lineRule="auto" w:before="0" w:after="200"/>
         <w:jc w:val="left"/>
       </w:pPr>
       <w:r>
@@ -364,7 +417,7 @@
     </w:p>
     <w:p>
       <w:pPr>
-        <w:spacing w:line="317" w:lineRule="auto" w:before="0" w:after="200"/>
+        <w:spacing w:line="300" w:lineRule="auto" w:before="0" w:after="200"/>
         <w:jc w:val="left"/>
       </w:pPr>
       <w:r>
@@ -379,7 +432,7 @@
     </w:p>
     <w:p>
       <w:pPr>
-        <w:spacing w:line="317" w:lineRule="auto" w:before="0" w:after="200"/>
+        <w:spacing w:line="300" w:lineRule="auto" w:before="0" w:after="200"/>
         <w:jc w:val="left"/>
       </w:pPr>
       <w:r>
@@ -394,7 +447,7 @@
     </w:p>
     <w:p>
       <w:pPr>
-        <w:spacing w:line="317" w:lineRule="auto" w:before="0" w:after="200"/>
+        <w:spacing w:line="300" w:lineRule="auto" w:before="0" w:after="200"/>
         <w:jc w:val="left"/>
       </w:pPr>
       <w:r>
@@ -417,7 +470,7 @@
     </w:p>
     <w:p>
       <w:pPr>
-        <w:spacing w:line="317" w:lineRule="auto" w:before="0" w:after="200"/>
+        <w:spacing w:line="300" w:lineRule="auto" w:before="0" w:after="200"/>
         <w:jc w:val="left"/>
       </w:pPr>
       <w:r>
@@ -432,7 +485,7 @@
     </w:p>
     <w:p>
       <w:pPr>
-        <w:spacing w:line="317" w:lineRule="auto" w:before="0" w:after="200"/>
+        <w:spacing w:line="300" w:lineRule="auto" w:before="0" w:after="200"/>
         <w:jc w:val="left"/>
       </w:pPr>
       <w:r>
@@ -447,7 +500,7 @@
     </w:p>
     <w:p>
       <w:pPr>
-        <w:spacing w:line="317" w:lineRule="auto" w:before="0" w:after="200"/>
+        <w:spacing w:line="300" w:lineRule="auto" w:before="0" w:after="200"/>
         <w:jc w:val="left"/>
       </w:pPr>
       <w:r>
@@ -470,7 +523,7 @@
     </w:p>
     <w:p>
       <w:pPr>
-        <w:spacing w:line="317" w:lineRule="auto" w:before="0" w:after="200"/>
+        <w:spacing w:line="300" w:lineRule="auto" w:before="0" w:after="200"/>
         <w:jc w:val="left"/>
       </w:pPr>
       <w:r>
@@ -485,7 +538,7 @@
     </w:p>
     <w:p>
       <w:pPr>
-        <w:spacing w:line="317" w:lineRule="auto" w:before="0" w:after="160"/>
+        <w:spacing w:line="300" w:lineRule="auto" w:before="0" w:after="160"/>
         <w:ind w:left="576"/>
         <w:jc w:val="left"/>
       </w:pPr>
@@ -501,7 +554,7 @@
     </w:p>
     <w:p>
       <w:pPr>
-        <w:spacing w:line="317" w:lineRule="auto" w:before="0" w:after="160"/>
+        <w:spacing w:line="300" w:lineRule="auto" w:before="0" w:after="160"/>
         <w:ind w:left="576"/>
         <w:jc w:val="left"/>
       </w:pPr>
@@ -517,7 +570,7 @@
     </w:p>
     <w:p>
       <w:pPr>
-        <w:spacing w:line="317" w:lineRule="auto" w:before="0" w:after="160"/>
+        <w:spacing w:line="300" w:lineRule="auto" w:before="0" w:after="160"/>
         <w:ind w:left="576"/>
         <w:jc w:val="left"/>
       </w:pPr>
@@ -541,7 +594,7 @@
     </w:p>
     <w:p>
       <w:pPr>
-        <w:spacing w:line="317" w:lineRule="auto" w:before="0" w:after="200"/>
+        <w:spacing w:line="300" w:lineRule="auto" w:before="0" w:after="200"/>
         <w:jc w:val="left"/>
       </w:pPr>
       <w:r>
@@ -564,7 +617,7 @@
     </w:p>
     <w:p>
       <w:pPr>
-        <w:spacing w:line="317" w:lineRule="auto" w:before="0" w:after="200"/>
+        <w:spacing w:line="300" w:lineRule="auto" w:before="0" w:after="200"/>
         <w:jc w:val="left"/>
       </w:pPr>
       <w:r>
@@ -579,7 +632,7 @@
     </w:p>
     <w:p>
       <w:pPr>
-        <w:spacing w:line="317" w:lineRule="auto" w:before="0" w:after="200"/>
+        <w:spacing w:line="300" w:lineRule="auto" w:before="0" w:after="200"/>
         <w:jc w:val="left"/>
       </w:pPr>
       <w:r>
@@ -602,7 +655,7 @@
     </w:p>
     <w:p>
       <w:pPr>
-        <w:spacing w:line="317" w:lineRule="auto" w:before="0" w:after="200"/>
+        <w:spacing w:line="300" w:lineRule="auto" w:before="0" w:after="200"/>
         <w:jc w:val="left"/>
       </w:pPr>
       <w:r>
@@ -625,7 +678,7 @@
     </w:p>
     <w:p>
       <w:pPr>
-        <w:spacing w:line="317" w:lineRule="auto" w:before="0" w:after="200"/>
+        <w:spacing w:line="300" w:lineRule="auto" w:before="0" w:after="200"/>
         <w:jc w:val="left"/>
       </w:pPr>
       <w:r>
@@ -645,7 +698,7 @@
     </w:p>
     <w:p>
       <w:pPr>
-        <w:spacing w:line="276" w:lineRule="auto" w:before="0" w:after="120"/>
+        <w:spacing w:line="300" w:lineRule="auto" w:before="0" w:after="120"/>
         <w:jc w:val="center"/>
       </w:pPr>
       <w:r>
@@ -660,7 +713,7 @@
     </w:p>
     <w:p>
       <w:pPr>
-        <w:spacing w:line="276" w:lineRule="auto" w:before="0" w:after="120"/>
+        <w:spacing w:line="300" w:lineRule="auto" w:before="0" w:after="120"/>
         <w:jc w:val="center"/>
       </w:pPr>
       <w:r>
@@ -675,7 +728,7 @@
     </w:p>
     <w:p>
       <w:pPr>
-        <w:spacing w:line="317" w:lineRule="auto" w:before="0" w:after="200"/>
+        <w:spacing w:line="300" w:lineRule="auto" w:before="0" w:after="200"/>
         <w:jc w:val="left"/>
       </w:pPr>
     </w:p>
@@ -689,7 +742,7 @@
     </w:p>
     <w:p>
       <w:pPr>
-        <w:spacing w:line="317" w:lineRule="auto" w:before="0" w:after="200"/>
+        <w:spacing w:line="300" w:lineRule="auto" w:before="0" w:after="200"/>
         <w:jc w:val="left"/>
       </w:pPr>
       <w:r>
@@ -704,7 +757,7 @@
     </w:p>
     <w:p>
       <w:pPr>
-        <w:spacing w:line="317" w:lineRule="auto" w:before="0" w:after="200"/>
+        <w:spacing w:line="300" w:lineRule="auto" w:before="0" w:after="200"/>
         <w:jc w:val="left"/>
       </w:pPr>
       <w:r>
@@ -727,7 +780,7 @@
     </w:p>
     <w:p>
       <w:pPr>
-        <w:spacing w:line="317" w:lineRule="auto" w:before="0" w:after="200"/>
+        <w:spacing w:line="300" w:lineRule="auto" w:before="0" w:after="200"/>
         <w:jc w:val="left"/>
       </w:pPr>
       <w:r>
@@ -742,7 +795,7 @@
     </w:p>
     <w:p>
       <w:pPr>
-        <w:spacing w:line="317" w:lineRule="auto" w:before="0" w:after="200"/>
+        <w:spacing w:line="300" w:lineRule="auto" w:before="0" w:after="200"/>
         <w:jc w:val="left"/>
       </w:pPr>
       <w:r>
@@ -757,7 +810,7 @@
     </w:p>
     <w:p>
       <w:pPr>
-        <w:spacing w:line="317" w:lineRule="auto" w:before="0" w:after="200"/>
+        <w:spacing w:line="300" w:lineRule="auto" w:before="0" w:after="200"/>
         <w:jc w:val="left"/>
       </w:pPr>
       <w:r>
@@ -780,7 +833,7 @@
     </w:p>
     <w:p>
       <w:pPr>
-        <w:spacing w:line="317" w:lineRule="auto" w:before="0" w:after="200"/>
+        <w:spacing w:line="300" w:lineRule="auto" w:before="0" w:after="200"/>
         <w:jc w:val="left"/>
       </w:pPr>
       <w:r>
@@ -795,7 +848,7 @@
     </w:p>
     <w:p>
       <w:pPr>
-        <w:spacing w:line="317" w:lineRule="auto" w:before="0" w:after="200"/>
+        <w:spacing w:line="300" w:lineRule="auto" w:before="0" w:after="200"/>
         <w:jc w:val="left"/>
       </w:pPr>
       <w:r>
@@ -818,7 +871,7 @@
     </w:p>
     <w:p>
       <w:pPr>
-        <w:spacing w:line="317" w:lineRule="auto" w:before="0" w:after="200"/>
+        <w:spacing w:line="300" w:lineRule="auto" w:before="0" w:after="200"/>
         <w:jc w:val="left"/>
       </w:pPr>
       <w:r>
@@ -841,7 +894,7 @@
     </w:p>
     <w:p>
       <w:pPr>
-        <w:spacing w:line="317" w:lineRule="auto" w:before="0" w:after="200"/>
+        <w:spacing w:line="300" w:lineRule="auto" w:before="0" w:after="200"/>
         <w:jc w:val="left"/>
       </w:pPr>
       <w:r>
@@ -864,7 +917,7 @@
     </w:p>
     <w:p>
       <w:pPr>
-        <w:spacing w:line="317" w:lineRule="auto" w:before="0" w:after="200"/>
+        <w:spacing w:line="300" w:lineRule="auto" w:before="0" w:after="200"/>
         <w:jc w:val="left"/>
       </w:pPr>
       <w:r>
@@ -884,7 +937,7 @@
     </w:p>
     <w:p>
       <w:pPr>
-        <w:spacing w:line="276" w:lineRule="auto" w:before="0" w:after="120"/>
+        <w:spacing w:line="300" w:lineRule="auto" w:before="0" w:after="120"/>
         <w:jc w:val="center"/>
       </w:pPr>
       <w:r>
@@ -899,7 +952,7 @@
     </w:p>
     <w:p>
       <w:pPr>
-        <w:spacing w:line="276" w:lineRule="auto" w:before="0" w:after="120"/>
+        <w:spacing w:line="300" w:lineRule="auto" w:before="0" w:after="120"/>
         <w:jc w:val="center"/>
       </w:pPr>
       <w:r>
@@ -909,12 +962,12 @@
           <w:i w:val="0"/>
           <w:sz w:val="32"/>
         </w:rPr>
-        <w:t>MATERIALS AND METHODS</w:t>
+        <w:t>METHODOLOGY</w:t>
       </w:r>
     </w:p>
     <w:p>
       <w:pPr>
-        <w:spacing w:line="317" w:lineRule="auto" w:before="0" w:after="200"/>
+        <w:spacing w:line="300" w:lineRule="auto" w:before="0" w:after="200"/>
         <w:jc w:val="left"/>
       </w:pPr>
     </w:p>
@@ -928,7 +981,7 @@
     </w:p>
     <w:p>
       <w:pPr>
-        <w:spacing w:line="317" w:lineRule="auto" w:before="0" w:after="200"/>
+        <w:spacing w:line="300" w:lineRule="auto" w:before="0" w:after="200"/>
         <w:jc w:val="left"/>
       </w:pPr>
       <w:r>
@@ -943,7 +996,7 @@
     </w:p>
     <w:p>
       <w:pPr>
-        <w:spacing w:line="317" w:lineRule="auto" w:before="0" w:after="200"/>
+        <w:spacing w:line="300" w:lineRule="auto" w:before="0" w:after="200"/>
         <w:jc w:val="left"/>
       </w:pPr>
       <w:r>
@@ -2016,7 +2069,7 @@
     </w:p>
     <w:p>
       <w:pPr>
-        <w:spacing w:line="317" w:lineRule="auto" w:before="0" w:after="200"/>
+        <w:spacing w:line="300" w:lineRule="auto" w:before="0" w:after="200"/>
         <w:jc w:val="left"/>
       </w:pPr>
       <w:r>
@@ -2031,7 +2084,7 @@
     </w:p>
     <w:p>
       <w:pPr>
-        <w:spacing w:line="317" w:lineRule="auto" w:before="0" w:after="200"/>
+        <w:spacing w:line="300" w:lineRule="auto" w:before="0" w:after="200"/>
         <w:jc w:val="left"/>
       </w:pPr>
       <w:r>
@@ -2062,7 +2115,7 @@
     </w:p>
     <w:p>
       <w:pPr>
-        <w:spacing w:line="317" w:lineRule="auto" w:before="0" w:after="200"/>
+        <w:spacing w:line="300" w:lineRule="auto" w:before="0" w:after="200"/>
         <w:jc w:val="left"/>
       </w:pPr>
       <w:r>
@@ -2085,7 +2138,7 @@
     </w:p>
     <w:p>
       <w:pPr>
-        <w:spacing w:line="317" w:lineRule="auto" w:before="0" w:after="200"/>
+        <w:spacing w:line="300" w:lineRule="auto" w:before="0" w:after="200"/>
         <w:jc w:val="left"/>
       </w:pPr>
       <w:r>
@@ -2103,7 +2156,7 @@
         <w:tabs>
           <w:tab w:pos="9360" w:val="right"/>
         </w:tabs>
-        <w:spacing w:line="317" w:lineRule="auto" w:before="80" w:after="80"/>
+        <w:spacing w:line="300" w:lineRule="auto" w:before="80" w:after="80"/>
       </w:pPr>
       <w:r>
         <w:rPr>
@@ -2118,7 +2171,7 @@
     </w:p>
     <w:p>
       <w:pPr>
-        <w:spacing w:line="317" w:lineRule="auto" w:before="0" w:after="200"/>
+        <w:spacing w:line="300" w:lineRule="auto" w:before="0" w:after="200"/>
         <w:jc w:val="left"/>
       </w:pPr>
       <w:r>
@@ -2136,7 +2189,7 @@
         <w:tabs>
           <w:tab w:pos="9360" w:val="right"/>
         </w:tabs>
-        <w:spacing w:line="317" w:lineRule="auto" w:before="80" w:after="80"/>
+        <w:spacing w:line="300" w:lineRule="auto" w:before="80" w:after="80"/>
       </w:pPr>
       <w:r>
         <w:rPr>
@@ -2151,7 +2204,7 @@
     </w:p>
     <w:p>
       <w:pPr>
-        <w:spacing w:line="317" w:lineRule="auto" w:before="0" w:after="200"/>
+        <w:spacing w:line="300" w:lineRule="auto" w:before="0" w:after="200"/>
         <w:jc w:val="left"/>
       </w:pPr>
       <w:r>
@@ -2174,7 +2227,7 @@
     </w:p>
     <w:p>
       <w:pPr>
-        <w:spacing w:line="317" w:lineRule="auto" w:before="0" w:after="200"/>
+        <w:spacing w:line="300" w:lineRule="auto" w:before="0" w:after="200"/>
         <w:jc w:val="left"/>
       </w:pPr>
       <w:r>
@@ -2189,7 +2242,7 @@
     </w:p>
     <w:p>
       <w:pPr>
-        <w:spacing w:line="317" w:lineRule="auto" w:before="0" w:after="200"/>
+        <w:spacing w:line="300" w:lineRule="auto" w:before="0" w:after="200"/>
         <w:jc w:val="left"/>
       </w:pPr>
       <w:r>
@@ -2212,7 +2265,7 @@
     </w:p>
     <w:p>
       <w:pPr>
-        <w:spacing w:line="317" w:lineRule="auto" w:before="0" w:after="200"/>
+        <w:spacing w:line="300" w:lineRule="auto" w:before="0" w:after="200"/>
         <w:jc w:val="left"/>
       </w:pPr>
       <w:r>
@@ -2235,7 +2288,7 @@
     </w:p>
     <w:p>
       <w:pPr>
-        <w:spacing w:line="317" w:lineRule="auto" w:before="0" w:after="200"/>
+        <w:spacing w:line="300" w:lineRule="auto" w:before="0" w:after="200"/>
         <w:jc w:val="left"/>
       </w:pPr>
       <w:r>
@@ -3426,7 +3479,7 @@
     </w:p>
     <w:p>
       <w:pPr>
-        <w:spacing w:line="317" w:lineRule="auto" w:before="0" w:after="200"/>
+        <w:spacing w:line="300" w:lineRule="auto" w:before="0" w:after="200"/>
         <w:jc w:val="left"/>
       </w:pPr>
       <w:r>
@@ -3449,7 +3502,7 @@
     </w:p>
     <w:p>
       <w:pPr>
-        <w:spacing w:line="317" w:lineRule="auto" w:before="0" w:after="200"/>
+        <w:spacing w:line="300" w:lineRule="auto" w:before="0" w:after="200"/>
         <w:jc w:val="left"/>
       </w:pPr>
       <w:r>
@@ -3464,7 +3517,7 @@
     </w:p>
     <w:p>
       <w:pPr>
-        <w:spacing w:line="317" w:lineRule="auto" w:before="0" w:after="200"/>
+        <w:spacing w:line="300" w:lineRule="auto" w:before="0" w:after="200"/>
         <w:jc w:val="left"/>
       </w:pPr>
       <w:r>
@@ -3479,7 +3532,7 @@
     </w:p>
     <w:p>
       <w:pPr>
-        <w:spacing w:line="317" w:lineRule="auto" w:before="0" w:after="200"/>
+        <w:spacing w:line="300" w:lineRule="auto" w:before="0" w:after="200"/>
         <w:jc w:val="left"/>
       </w:pPr>
       <w:r>
@@ -3494,7 +3547,7 @@
     </w:p>
     <w:p>
       <w:pPr>
-        <w:spacing w:line="317" w:lineRule="auto" w:before="0" w:after="200"/>
+        <w:spacing w:line="300" w:lineRule="auto" w:before="0" w:after="200"/>
         <w:jc w:val="left"/>
       </w:pPr>
       <w:r>
@@ -3517,7 +3570,7 @@
     </w:p>
     <w:p>
       <w:pPr>
-        <w:spacing w:line="317" w:lineRule="auto" w:before="0" w:after="200"/>
+        <w:spacing w:line="300" w:lineRule="auto" w:before="0" w:after="200"/>
         <w:jc w:val="left"/>
       </w:pPr>
       <w:r>
@@ -4585,7 +4638,7 @@
     </w:p>
     <w:p>
       <w:pPr>
-        <w:spacing w:line="317" w:lineRule="auto" w:before="0" w:after="200"/>
+        <w:spacing w:line="300" w:lineRule="auto" w:before="0" w:after="200"/>
         <w:jc w:val="left"/>
       </w:pPr>
       <w:r>
@@ -4603,7 +4656,7 @@
         <w:tabs>
           <w:tab w:pos="9360" w:val="right"/>
         </w:tabs>
-        <w:spacing w:line="317" w:lineRule="auto" w:before="80" w:after="80"/>
+        <w:spacing w:line="300" w:lineRule="auto" w:before="80" w:after="80"/>
       </w:pPr>
       <w:r>
         <w:rPr>
@@ -4618,7 +4671,7 @@
     </w:p>
     <w:p>
       <w:pPr>
-        <w:spacing w:line="317" w:lineRule="auto" w:before="0" w:after="200"/>
+        <w:spacing w:line="300" w:lineRule="auto" w:before="0" w:after="200"/>
         <w:jc w:val="left"/>
       </w:pPr>
       <w:r>
@@ -4641,7 +4694,7 @@
     </w:p>
     <w:p>
       <w:pPr>
-        <w:spacing w:line="317" w:lineRule="auto" w:before="0" w:after="200"/>
+        <w:spacing w:line="300" w:lineRule="auto" w:before="0" w:after="200"/>
         <w:jc w:val="left"/>
       </w:pPr>
       <w:r>
@@ -4659,7 +4712,7 @@
         <w:tabs>
           <w:tab w:pos="9360" w:val="right"/>
         </w:tabs>
-        <w:spacing w:line="317" w:lineRule="auto" w:before="80" w:after="80"/>
+        <w:spacing w:line="300" w:lineRule="auto" w:before="80" w:after="80"/>
       </w:pPr>
       <w:r>
         <w:rPr>
@@ -4677,7 +4730,7 @@
         <w:tabs>
           <w:tab w:pos="9360" w:val="right"/>
         </w:tabs>
-        <w:spacing w:line="317" w:lineRule="auto" w:before="80" w:after="80"/>
+        <w:spacing w:line="300" w:lineRule="auto" w:before="80" w:after="80"/>
       </w:pPr>
       <w:r>
         <w:rPr>
@@ -4692,7 +4745,7 @@
     </w:p>
     <w:p>
       <w:pPr>
-        <w:spacing w:line="317" w:lineRule="auto" w:before="0" w:after="200"/>
+        <w:spacing w:line="300" w:lineRule="auto" w:before="0" w:after="200"/>
         <w:jc w:val="left"/>
       </w:pPr>
       <w:r>
@@ -4715,7 +4768,7 @@
     </w:p>
     <w:p>
       <w:pPr>
-        <w:spacing w:line="317" w:lineRule="auto" w:before="0" w:after="200"/>
+        <w:spacing w:line="300" w:lineRule="auto" w:before="0" w:after="200"/>
         <w:jc w:val="left"/>
       </w:pPr>
       <w:r>
@@ -4733,7 +4786,7 @@
         <w:tabs>
           <w:tab w:pos="9360" w:val="right"/>
         </w:tabs>
-        <w:spacing w:line="317" w:lineRule="auto" w:before="80" w:after="80"/>
+        <w:spacing w:line="300" w:lineRule="auto" w:before="80" w:after="80"/>
       </w:pPr>
       <w:r>
         <w:rPr>
@@ -4751,7 +4804,7 @@
         <w:tabs>
           <w:tab w:pos="9360" w:val="right"/>
         </w:tabs>
-        <w:spacing w:line="317" w:lineRule="auto" w:before="80" w:after="80"/>
+        <w:spacing w:line="300" w:lineRule="auto" w:before="80" w:after="80"/>
       </w:pPr>
       <w:r>
         <w:rPr>
@@ -4769,7 +4822,7 @@
         <w:tabs>
           <w:tab w:pos="9360" w:val="right"/>
         </w:tabs>
-        <w:spacing w:line="317" w:lineRule="auto" w:before="80" w:after="80"/>
+        <w:spacing w:line="300" w:lineRule="auto" w:before="80" w:after="80"/>
       </w:pPr>
       <w:r>
         <w:rPr>
@@ -4787,7 +4840,7 @@
         <w:tabs>
           <w:tab w:pos="9360" w:val="right"/>
         </w:tabs>
-        <w:spacing w:line="317" w:lineRule="auto" w:before="80" w:after="80"/>
+        <w:spacing w:line="300" w:lineRule="auto" w:before="80" w:after="80"/>
       </w:pPr>
       <w:r>
         <w:rPr>
@@ -4802,7 +4855,7 @@
     </w:p>
     <w:p>
       <w:pPr>
-        <w:spacing w:line="317" w:lineRule="auto" w:before="0" w:after="200"/>
+        <w:spacing w:line="300" w:lineRule="auto" w:before="0" w:after="200"/>
         <w:jc w:val="left"/>
       </w:pPr>
       <w:r>
@@ -4825,7 +4878,7 @@
     </w:p>
     <w:p>
       <w:pPr>
-        <w:spacing w:line="317" w:lineRule="auto" w:before="0" w:after="200"/>
+        <w:spacing w:line="300" w:lineRule="auto" w:before="0" w:after="200"/>
         <w:jc w:val="left"/>
       </w:pPr>
       <w:r>
@@ -4843,7 +4896,7 @@
         <w:tabs>
           <w:tab w:pos="9360" w:val="right"/>
         </w:tabs>
-        <w:spacing w:line="317" w:lineRule="auto" w:before="80" w:after="80"/>
+        <w:spacing w:line="300" w:lineRule="auto" w:before="80" w:after="80"/>
       </w:pPr>
       <w:r>
         <w:rPr>
@@ -4858,7 +4911,7 @@
     </w:p>
     <w:p>
       <w:pPr>
-        <w:spacing w:line="317" w:lineRule="auto" w:before="0" w:after="200"/>
+        <w:spacing w:line="300" w:lineRule="auto" w:before="0" w:after="200"/>
         <w:jc w:val="left"/>
       </w:pPr>
       <w:r>
@@ -4881,7 +4934,7 @@
     </w:p>
     <w:p>
       <w:pPr>
-        <w:spacing w:line="317" w:lineRule="auto" w:before="0" w:after="200"/>
+        <w:spacing w:line="300" w:lineRule="auto" w:before="0" w:after="200"/>
         <w:jc w:val="left"/>
       </w:pPr>
       <w:r>
@@ -4896,7 +4949,7 @@
     </w:p>
     <w:p>
       <w:pPr>
-        <w:spacing w:line="317" w:lineRule="auto" w:before="0" w:after="200"/>
+        <w:spacing w:line="300" w:lineRule="auto" w:before="0" w:after="200"/>
         <w:jc w:val="left"/>
       </w:pPr>
       <w:r>
@@ -4919,7 +4972,7 @@
     </w:p>
     <w:p>
       <w:pPr>
-        <w:spacing w:line="317" w:lineRule="auto" w:before="0" w:after="200"/>
+        <w:spacing w:line="300" w:lineRule="auto" w:before="0" w:after="200"/>
         <w:jc w:val="left"/>
       </w:pPr>
       <w:r>
@@ -5561,7 +5614,7 @@
     </w:p>
     <w:p>
       <w:pPr>
-        <w:spacing w:line="317" w:lineRule="auto" w:before="0" w:after="200"/>
+        <w:spacing w:line="300" w:lineRule="auto" w:before="0" w:after="200"/>
         <w:jc w:val="left"/>
       </w:pPr>
       <w:r>
@@ -5584,7 +5637,7 @@
     </w:p>
     <w:p>
       <w:pPr>
-        <w:spacing w:line="317" w:lineRule="auto" w:before="0" w:after="200"/>
+        <w:spacing w:line="300" w:lineRule="auto" w:before="0" w:after="200"/>
         <w:jc w:val="left"/>
       </w:pPr>
       <w:r>
@@ -5599,7 +5652,7 @@
     </w:p>
     <w:p>
       <w:pPr>
-        <w:spacing w:line="317" w:lineRule="auto" w:before="0" w:after="200"/>
+        <w:spacing w:line="300" w:lineRule="auto" w:before="0" w:after="200"/>
         <w:jc w:val="left"/>
       </w:pPr>
       <w:r>
@@ -5614,7 +5667,7 @@
     </w:p>
     <w:p>
       <w:pPr>
-        <w:spacing w:line="317" w:lineRule="auto" w:before="0" w:after="200"/>
+        <w:spacing w:line="300" w:lineRule="auto" w:before="0" w:after="200"/>
         <w:jc w:val="left"/>
       </w:pPr>
       <w:r>
@@ -5637,7 +5690,7 @@
     </w:p>
     <w:p>
       <w:pPr>
-        <w:spacing w:line="317" w:lineRule="auto" w:before="0" w:after="200"/>
+        <w:spacing w:line="300" w:lineRule="auto" w:before="0" w:after="200"/>
         <w:jc w:val="left"/>
       </w:pPr>
       <w:r>
@@ -5660,7 +5713,7 @@
     </w:p>
     <w:p>
       <w:pPr>
-        <w:spacing w:line="317" w:lineRule="auto" w:before="0" w:after="200"/>
+        <w:spacing w:line="300" w:lineRule="auto" w:before="0" w:after="200"/>
         <w:jc w:val="left"/>
       </w:pPr>
       <w:r>
@@ -5675,7 +5728,7 @@
     </w:p>
     <w:p>
       <w:pPr>
-        <w:spacing w:line="317" w:lineRule="auto" w:before="0" w:after="200"/>
+        <w:spacing w:line="300" w:lineRule="auto" w:before="0" w:after="200"/>
         <w:jc w:val="left"/>
       </w:pPr>
       <w:r>
@@ -5698,7 +5751,7 @@
     </w:p>
     <w:p>
       <w:pPr>
-        <w:spacing w:line="317" w:lineRule="auto" w:before="0" w:after="200"/>
+        <w:spacing w:line="300" w:lineRule="auto" w:before="0" w:after="200"/>
         <w:jc w:val="left"/>
       </w:pPr>
       <w:r>
@@ -5713,7 +5766,7 @@
     </w:p>
     <w:p>
       <w:pPr>
-        <w:spacing w:line="317" w:lineRule="auto" w:before="0" w:after="200"/>
+        <w:spacing w:line="300" w:lineRule="auto" w:before="0" w:after="200"/>
         <w:jc w:val="left"/>
       </w:pPr>
       <w:r>
@@ -5728,7 +5781,7 @@
     </w:p>
     <w:p>
       <w:pPr>
-        <w:spacing w:line="317" w:lineRule="auto" w:before="0" w:after="200"/>
+        <w:spacing w:line="300" w:lineRule="auto" w:before="0" w:after="200"/>
         <w:jc w:val="left"/>
       </w:pPr>
       <w:r>
@@ -5751,7 +5804,7 @@
     </w:p>
     <w:p>
       <w:pPr>
-        <w:spacing w:line="317" w:lineRule="auto" w:before="0" w:after="200"/>
+        <w:spacing w:line="300" w:lineRule="auto" w:before="0" w:after="200"/>
         <w:jc w:val="left"/>
       </w:pPr>
       <w:r>
@@ -5766,7 +5819,7 @@
     </w:p>
     <w:p>
       <w:pPr>
-        <w:spacing w:line="317" w:lineRule="auto" w:before="0" w:after="200"/>
+        <w:spacing w:line="300" w:lineRule="auto" w:before="0" w:after="200"/>
         <w:jc w:val="left"/>
       </w:pPr>
       <w:r>
@@ -5786,7 +5839,7 @@
     </w:p>
     <w:p>
       <w:pPr>
-        <w:spacing w:line="276" w:lineRule="auto" w:before="0" w:after="120"/>
+        <w:spacing w:line="300" w:lineRule="auto" w:before="0" w:after="120"/>
         <w:jc w:val="center"/>
       </w:pPr>
       <w:r>
@@ -5801,7 +5854,7 @@
     </w:p>
     <w:p>
       <w:pPr>
-        <w:spacing w:line="276" w:lineRule="auto" w:before="0" w:after="120"/>
+        <w:spacing w:line="300" w:lineRule="auto" w:before="0" w:after="120"/>
         <w:jc w:val="center"/>
       </w:pPr>
       <w:r>
@@ -5816,7 +5869,7 @@
     </w:p>
     <w:p>
       <w:pPr>
-        <w:spacing w:line="317" w:lineRule="auto" w:before="0" w:after="200"/>
+        <w:spacing w:line="300" w:lineRule="auto" w:before="0" w:after="200"/>
         <w:jc w:val="left"/>
       </w:pPr>
     </w:p>
@@ -5830,7 +5883,7 @@
     </w:p>
     <w:p>
       <w:pPr>
-        <w:spacing w:line="317" w:lineRule="auto" w:before="0" w:after="200"/>
+        <w:spacing w:line="300" w:lineRule="auto" w:before="0" w:after="200"/>
         <w:jc w:val="left"/>
       </w:pPr>
       <w:r>
@@ -5845,7 +5898,7 @@
     </w:p>
     <w:p>
       <w:pPr>
-        <w:spacing w:line="317" w:lineRule="auto" w:before="0" w:after="200"/>
+        <w:spacing w:line="300" w:lineRule="auto" w:before="0" w:after="200"/>
         <w:jc w:val="left"/>
       </w:pPr>
       <w:r>
@@ -5860,7 +5913,7 @@
     </w:p>
     <w:p>
       <w:pPr>
-        <w:spacing w:line="317" w:lineRule="auto" w:before="0" w:after="200"/>
+        <w:spacing w:line="300" w:lineRule="auto" w:before="0" w:after="200"/>
         <w:jc w:val="left"/>
       </w:pPr>
       <w:r>
@@ -5875,7 +5928,7 @@
     </w:p>
     <w:p>
       <w:pPr>
-        <w:spacing w:line="317" w:lineRule="auto" w:before="0" w:after="200"/>
+        <w:spacing w:line="300" w:lineRule="auto" w:before="0" w:after="200"/>
         <w:jc w:val="left"/>
       </w:pPr>
       <w:r>
@@ -7290,7 +7343,7 @@
     </w:p>
     <w:p>
       <w:pPr>
-        <w:spacing w:line="317" w:lineRule="auto" w:before="0" w:after="200"/>
+        <w:spacing w:line="300" w:lineRule="auto" w:before="0" w:after="200"/>
         <w:jc w:val="left"/>
       </w:pPr>
       <w:r>
@@ -7305,7 +7358,7 @@
     </w:p>
     <w:p>
       <w:pPr>
-        <w:spacing w:line="317" w:lineRule="auto" w:before="0" w:after="200"/>
+        <w:spacing w:line="300" w:lineRule="auto" w:before="0" w:after="200"/>
         <w:jc w:val="left"/>
       </w:pPr>
       <w:r>
@@ -7320,7 +7373,7 @@
     </w:p>
     <w:p>
       <w:pPr>
-        <w:spacing w:line="317" w:lineRule="auto" w:before="0" w:after="200"/>
+        <w:spacing w:line="300" w:lineRule="auto" w:before="0" w:after="200"/>
         <w:jc w:val="left"/>
       </w:pPr>
       <w:r>
@@ -8362,7 +8415,7 @@
     </w:p>
     <w:p>
       <w:pPr>
-        <w:spacing w:line="317" w:lineRule="auto" w:before="0" w:after="200"/>
+        <w:spacing w:line="300" w:lineRule="auto" w:before="0" w:after="200"/>
         <w:jc w:val="left"/>
       </w:pPr>
       <w:r>
@@ -8377,7 +8430,7 @@
     </w:p>
     <w:p>
       <w:pPr>
-        <w:spacing w:line="317" w:lineRule="auto" w:before="0" w:after="200"/>
+        <w:spacing w:line="300" w:lineRule="auto" w:before="0" w:after="200"/>
         <w:jc w:val="left"/>
       </w:pPr>
       <w:r>
@@ -8392,7 +8445,7 @@
     </w:p>
     <w:p>
       <w:pPr>
-        <w:spacing w:line="317" w:lineRule="auto" w:before="0" w:after="200"/>
+        <w:spacing w:line="300" w:lineRule="auto" w:before="0" w:after="200"/>
         <w:jc w:val="left"/>
       </w:pPr>
       <w:r>
@@ -9744,7 +9797,7 @@
     </w:p>
     <w:p>
       <w:pPr>
-        <w:spacing w:line="317" w:lineRule="auto" w:before="0" w:after="200"/>
+        <w:spacing w:line="300" w:lineRule="auto" w:before="0" w:after="200"/>
         <w:jc w:val="left"/>
       </w:pPr>
       <w:r>
@@ -9759,7 +9812,7 @@
     </w:p>
     <w:p>
       <w:pPr>
-        <w:spacing w:line="317" w:lineRule="auto" w:before="0" w:after="200"/>
+        <w:spacing w:line="300" w:lineRule="auto" w:before="0" w:after="200"/>
         <w:jc w:val="left"/>
       </w:pPr>
       <w:r>
@@ -9774,7 +9827,7 @@
     </w:p>
     <w:p>
       <w:pPr>
-        <w:spacing w:line="317" w:lineRule="auto" w:before="0" w:after="200"/>
+        <w:spacing w:line="300" w:lineRule="auto" w:before="0" w:after="200"/>
         <w:jc w:val="left"/>
       </w:pPr>
       <w:r>
@@ -12221,7 +12274,7 @@
     </w:p>
     <w:p>
       <w:pPr>
-        <w:spacing w:line="317" w:lineRule="auto" w:before="0" w:after="200"/>
+        <w:spacing w:line="300" w:lineRule="auto" w:before="0" w:after="200"/>
         <w:jc w:val="left"/>
       </w:pPr>
       <w:r>
@@ -12236,7 +12289,7 @@
     </w:p>
     <w:p>
       <w:pPr>
-        <w:spacing w:line="317" w:lineRule="auto" w:before="0" w:after="200"/>
+        <w:spacing w:line="300" w:lineRule="auto" w:before="0" w:after="200"/>
         <w:jc w:val="left"/>
       </w:pPr>
       <w:r>
@@ -12251,7 +12304,7 @@
     </w:p>
     <w:p>
       <w:pPr>
-        <w:spacing w:line="317" w:lineRule="auto" w:before="0" w:after="200"/>
+        <w:spacing w:line="300" w:lineRule="auto" w:before="0" w:after="200"/>
         <w:jc w:val="left"/>
       </w:pPr>
       <w:r>
@@ -14170,7 +14223,7 @@
     </w:p>
     <w:p>
       <w:pPr>
-        <w:spacing w:line="317" w:lineRule="auto" w:before="0" w:after="200"/>
+        <w:spacing w:line="300" w:lineRule="auto" w:before="0" w:after="200"/>
         <w:jc w:val="left"/>
       </w:pPr>
       <w:r>
@@ -14185,7 +14238,7 @@
     </w:p>
     <w:p>
       <w:pPr>
-        <w:spacing w:line="317" w:lineRule="auto" w:before="0" w:after="200"/>
+        <w:spacing w:line="300" w:lineRule="auto" w:before="0" w:after="200"/>
         <w:jc w:val="left"/>
       </w:pPr>
       <w:r>
@@ -14200,7 +14253,7 @@
     </w:p>
     <w:p>
       <w:pPr>
-        <w:spacing w:line="317" w:lineRule="auto" w:before="0" w:after="200"/>
+        <w:spacing w:line="300" w:lineRule="auto" w:before="0" w:after="200"/>
         <w:jc w:val="left"/>
       </w:pPr>
       <w:r>
@@ -14223,7 +14276,7 @@
     </w:p>
     <w:p>
       <w:pPr>
-        <w:spacing w:line="317" w:lineRule="auto" w:before="0" w:after="200"/>
+        <w:spacing w:line="300" w:lineRule="auto" w:before="0" w:after="200"/>
         <w:jc w:val="left"/>
       </w:pPr>
       <w:r>
@@ -17181,7 +17234,7 @@
     </w:p>
     <w:p>
       <w:pPr>
-        <w:spacing w:line="317" w:lineRule="auto" w:before="0" w:after="200"/>
+        <w:spacing w:line="300" w:lineRule="auto" w:before="0" w:after="200"/>
         <w:jc w:val="left"/>
       </w:pPr>
       <w:r>
@@ -17196,7 +17249,7 @@
     </w:p>
     <w:p>
       <w:pPr>
-        <w:spacing w:line="317" w:lineRule="auto" w:before="0" w:after="200"/>
+        <w:spacing w:line="300" w:lineRule="auto" w:before="0" w:after="200"/>
         <w:jc w:val="left"/>
       </w:pPr>
       <w:r>
@@ -17282,7 +17335,7 @@
     </w:p>
     <w:p>
       <w:pPr>
-        <w:spacing w:line="317" w:lineRule="auto" w:before="0" w:after="200"/>
+        <w:spacing w:line="300" w:lineRule="auto" w:before="0" w:after="200"/>
         <w:jc w:val="left"/>
       </w:pPr>
       <w:r>
@@ -17297,7 +17350,7 @@
     </w:p>
     <w:p>
       <w:pPr>
-        <w:spacing w:line="317" w:lineRule="auto" w:before="0" w:after="200"/>
+        <w:spacing w:line="300" w:lineRule="auto" w:before="0" w:after="200"/>
         <w:jc w:val="left"/>
       </w:pPr>
       <w:r>
@@ -17312,7 +17365,7 @@
     </w:p>
     <w:p>
       <w:pPr>
-        <w:spacing w:line="317" w:lineRule="auto" w:before="0" w:after="200"/>
+        <w:spacing w:line="300" w:lineRule="auto" w:before="0" w:after="200"/>
         <w:jc w:val="left"/>
       </w:pPr>
       <w:r>
@@ -19386,7 +19439,7 @@
     </w:p>
     <w:p>
       <w:pPr>
-        <w:spacing w:line="317" w:lineRule="auto" w:before="0" w:after="200"/>
+        <w:spacing w:line="300" w:lineRule="auto" w:before="0" w:after="200"/>
         <w:jc w:val="left"/>
       </w:pPr>
       <w:r>
@@ -19401,7 +19454,7 @@
     </w:p>
     <w:p>
       <w:pPr>
-        <w:spacing w:line="317" w:lineRule="auto" w:before="0" w:after="200"/>
+        <w:spacing w:line="300" w:lineRule="auto" w:before="0" w:after="200"/>
         <w:jc w:val="left"/>
       </w:pPr>
       <w:r>
@@ -19487,7 +19540,7 @@
     </w:p>
     <w:p>
       <w:pPr>
-        <w:spacing w:line="317" w:lineRule="auto" w:before="0" w:after="200"/>
+        <w:spacing w:line="300" w:lineRule="auto" w:before="0" w:after="200"/>
         <w:jc w:val="left"/>
       </w:pPr>
       <w:r>
@@ -19502,7 +19555,7 @@
     </w:p>
     <w:p>
       <w:pPr>
-        <w:spacing w:line="317" w:lineRule="auto" w:before="0" w:after="200"/>
+        <w:spacing w:line="300" w:lineRule="auto" w:before="0" w:after="200"/>
         <w:jc w:val="left"/>
       </w:pPr>
       <w:r>
@@ -20929,7 +20982,7 @@
     </w:p>
     <w:p>
       <w:pPr>
-        <w:spacing w:line="317" w:lineRule="auto" w:before="0" w:after="200"/>
+        <w:spacing w:line="300" w:lineRule="auto" w:before="0" w:after="200"/>
         <w:jc w:val="left"/>
       </w:pPr>
       <w:r>
@@ -20944,7 +20997,7 @@
     </w:p>
     <w:p>
       <w:pPr>
-        <w:spacing w:line="317" w:lineRule="auto" w:before="0" w:after="200"/>
+        <w:spacing w:line="300" w:lineRule="auto" w:before="0" w:after="200"/>
         <w:jc w:val="left"/>
       </w:pPr>
       <w:r>
@@ -20959,7 +21012,7 @@
     </w:p>
     <w:p>
       <w:pPr>
-        <w:spacing w:line="317" w:lineRule="auto" w:before="0" w:after="200"/>
+        <w:spacing w:line="300" w:lineRule="auto" w:before="0" w:after="200"/>
         <w:jc w:val="left"/>
       </w:pPr>
       <w:r>
@@ -20974,7 +21027,7 @@
     </w:p>
     <w:p>
       <w:pPr>
-        <w:spacing w:line="317" w:lineRule="auto" w:before="0" w:after="200"/>
+        <w:spacing w:line="300" w:lineRule="auto" w:before="0" w:after="200"/>
         <w:jc w:val="left"/>
       </w:pPr>
       <w:r>
@@ -21060,7 +21113,7 @@
     </w:p>
     <w:p>
       <w:pPr>
-        <w:spacing w:line="317" w:lineRule="auto" w:before="0" w:after="200"/>
+        <w:spacing w:line="300" w:lineRule="auto" w:before="0" w:after="200"/>
         <w:jc w:val="left"/>
       </w:pPr>
       <w:r>
@@ -22685,7 +22738,7 @@
     </w:p>
     <w:p>
       <w:pPr>
-        <w:spacing w:line="317" w:lineRule="auto" w:before="0" w:after="200"/>
+        <w:spacing w:line="300" w:lineRule="auto" w:before="0" w:after="200"/>
         <w:jc w:val="left"/>
       </w:pPr>
       <w:r>
@@ -24563,7 +24616,7 @@
     </w:p>
     <w:p>
       <w:pPr>
-        <w:spacing w:line="317" w:lineRule="auto" w:before="0" w:after="200"/>
+        <w:spacing w:line="300" w:lineRule="auto" w:before="0" w:after="200"/>
         <w:jc w:val="left"/>
       </w:pPr>
       <w:r>
@@ -24578,7 +24631,7 @@
     </w:p>
     <w:p>
       <w:pPr>
-        <w:spacing w:line="317" w:lineRule="auto" w:before="0" w:after="200"/>
+        <w:spacing w:line="300" w:lineRule="auto" w:before="0" w:after="200"/>
         <w:jc w:val="left"/>
       </w:pPr>
       <w:r>
@@ -24593,7 +24646,7 @@
     </w:p>
     <w:p>
       <w:pPr>
-        <w:spacing w:line="317" w:lineRule="auto" w:before="0" w:after="200"/>
+        <w:spacing w:line="300" w:lineRule="auto" w:before="0" w:after="200"/>
         <w:jc w:val="left"/>
       </w:pPr>
       <w:r>
@@ -24679,7 +24732,7 @@
     </w:p>
     <w:p>
       <w:pPr>
-        <w:spacing w:line="317" w:lineRule="auto" w:before="0" w:after="200"/>
+        <w:spacing w:line="300" w:lineRule="auto" w:before="0" w:after="200"/>
         <w:jc w:val="left"/>
       </w:pPr>
       <w:r>
@@ -24702,7 +24755,7 @@
     </w:p>
     <w:p>
       <w:pPr>
-        <w:spacing w:line="317" w:lineRule="auto" w:before="0" w:after="200"/>
+        <w:spacing w:line="300" w:lineRule="auto" w:before="0" w:after="200"/>
         <w:jc w:val="left"/>
       </w:pPr>
       <w:r>
@@ -24717,7 +24770,7 @@
     </w:p>
     <w:p>
       <w:pPr>
-        <w:spacing w:line="317" w:lineRule="auto" w:before="0" w:after="200"/>
+        <w:spacing w:line="300" w:lineRule="auto" w:before="0" w:after="200"/>
         <w:jc w:val="left"/>
       </w:pPr>
       <w:r>
@@ -24732,7 +24785,7 @@
     </w:p>
     <w:p>
       <w:pPr>
-        <w:spacing w:line="317" w:lineRule="auto" w:before="0" w:after="200"/>
+        <w:spacing w:line="300" w:lineRule="auto" w:before="0" w:after="200"/>
         <w:jc w:val="left"/>
       </w:pPr>
       <w:r>
@@ -24747,7 +24800,7 @@
     </w:p>
     <w:p>
       <w:pPr>
-        <w:spacing w:line="317" w:lineRule="auto" w:before="0" w:after="200"/>
+        <w:spacing w:line="300" w:lineRule="auto" w:before="0" w:after="200"/>
         <w:jc w:val="left"/>
       </w:pPr>
       <w:r>
@@ -24770,7 +24823,7 @@
     </w:p>
     <w:p>
       <w:pPr>
-        <w:spacing w:line="317" w:lineRule="auto" w:before="0" w:after="200"/>
+        <w:spacing w:line="300" w:lineRule="auto" w:before="0" w:after="200"/>
         <w:jc w:val="left"/>
       </w:pPr>
       <w:r>
@@ -24785,7 +24838,7 @@
     </w:p>
     <w:p>
       <w:pPr>
-        <w:spacing w:line="317" w:lineRule="auto" w:before="0" w:after="200"/>
+        <w:spacing w:line="300" w:lineRule="auto" w:before="0" w:after="200"/>
         <w:jc w:val="left"/>
       </w:pPr>
       <w:r>
@@ -24800,7 +24853,7 @@
     </w:p>
     <w:p>
       <w:pPr>
-        <w:spacing w:line="317" w:lineRule="auto" w:before="0" w:after="200"/>
+        <w:spacing w:line="300" w:lineRule="auto" w:before="0" w:after="200"/>
         <w:jc w:val="left"/>
       </w:pPr>
       <w:r>
@@ -24820,7 +24873,7 @@
     </w:p>
     <w:p>
       <w:pPr>
-        <w:spacing w:line="276" w:lineRule="auto" w:before="0" w:after="120"/>
+        <w:spacing w:line="300" w:lineRule="auto" w:before="0" w:after="120"/>
         <w:jc w:val="center"/>
       </w:pPr>
       <w:r>
@@ -24835,7 +24888,7 @@
     </w:p>
     <w:p>
       <w:pPr>
-        <w:spacing w:line="276" w:lineRule="auto" w:before="0" w:after="120"/>
+        <w:spacing w:line="300" w:lineRule="auto" w:before="0" w:after="120"/>
         <w:jc w:val="center"/>
       </w:pPr>
       <w:r>
@@ -24845,12 +24898,12 @@
           <w:i w:val="0"/>
           <w:sz w:val="32"/>
         </w:rPr>
-        <w:t>SUMMARY, CONCLUSIONS AND RECOMMENDATIONS</w:t>
+        <w:t>CONCLUSION</w:t>
       </w:r>
     </w:p>
     <w:p>
       <w:pPr>
-        <w:spacing w:line="317" w:lineRule="auto" w:before="0" w:after="200"/>
+        <w:spacing w:line="300" w:lineRule="auto" w:before="0" w:after="200"/>
         <w:jc w:val="left"/>
       </w:pPr>
     </w:p>
@@ -24864,7 +24917,7 @@
     </w:p>
     <w:p>
       <w:pPr>
-        <w:spacing w:line="317" w:lineRule="auto" w:before="0" w:after="200"/>
+        <w:spacing w:line="300" w:lineRule="auto" w:before="0" w:after="200"/>
         <w:jc w:val="left"/>
       </w:pPr>
       <w:r>
@@ -24887,7 +24940,7 @@
     </w:p>
     <w:p>
       <w:pPr>
-        <w:spacing w:line="317" w:lineRule="auto" w:before="0" w:after="200"/>
+        <w:spacing w:line="300" w:lineRule="auto" w:before="0" w:after="200"/>
         <w:jc w:val="left"/>
       </w:pPr>
       <w:r>
@@ -24902,7 +24955,7 @@
     </w:p>
     <w:p>
       <w:pPr>
-        <w:spacing w:line="317" w:lineRule="auto" w:before="0" w:after="200"/>
+        <w:spacing w:line="300" w:lineRule="auto" w:before="0" w:after="200"/>
         <w:jc w:val="left"/>
       </w:pPr>
       <w:r>
@@ -24917,7 +24970,7 @@
     </w:p>
     <w:p>
       <w:pPr>
-        <w:spacing w:line="317" w:lineRule="auto" w:before="0" w:after="200"/>
+        <w:spacing w:line="300" w:lineRule="auto" w:before="0" w:after="200"/>
         <w:jc w:val="left"/>
       </w:pPr>
       <w:r>
@@ -24940,7 +24993,7 @@
     </w:p>
     <w:p>
       <w:pPr>
-        <w:spacing w:line="317" w:lineRule="auto" w:before="0" w:after="200"/>
+        <w:spacing w:line="300" w:lineRule="auto" w:before="0" w:after="200"/>
         <w:jc w:val="left"/>
       </w:pPr>
       <w:r>
@@ -24955,7 +25008,7 @@
     </w:p>
     <w:p>
       <w:pPr>
-        <w:spacing w:line="317" w:lineRule="auto" w:before="0" w:after="200"/>
+        <w:spacing w:line="300" w:lineRule="auto" w:before="0" w:after="200"/>
         <w:jc w:val="left"/>
       </w:pPr>
       <w:r>
@@ -24978,7 +25031,7 @@
     </w:p>
     <w:p>
       <w:pPr>
-        <w:spacing w:line="317" w:lineRule="auto" w:before="0" w:after="200"/>
+        <w:spacing w:line="300" w:lineRule="auto" w:before="0" w:after="200"/>
         <w:jc w:val="left"/>
       </w:pPr>
       <w:r>
@@ -25001,7 +25054,7 @@
     </w:p>
     <w:p>
       <w:pPr>
-        <w:spacing w:line="317" w:lineRule="auto" w:before="0" w:after="200"/>
+        <w:spacing w:line="300" w:lineRule="auto" w:before="0" w:after="200"/>
         <w:jc w:val="left"/>
       </w:pPr>
       <w:r>
@@ -25016,7 +25069,7 @@
     </w:p>
     <w:p>
       <w:pPr>
-        <w:spacing w:line="317" w:lineRule="auto" w:before="0" w:after="200"/>
+        <w:spacing w:line="300" w:lineRule="auto" w:before="0" w:after="200"/>
         <w:jc w:val="left"/>
       </w:pPr>
       <w:r>
@@ -25031,7 +25084,7 @@
     </w:p>
     <w:p>
       <w:pPr>
-        <w:spacing w:line="317" w:lineRule="auto" w:before="0" w:after="200"/>
+        <w:spacing w:line="300" w:lineRule="auto" w:before="0" w:after="200"/>
         <w:jc w:val="left"/>
       </w:pPr>
       <w:r>
@@ -25046,7 +25099,7 @@
     </w:p>
     <w:p>
       <w:pPr>
-        <w:spacing w:line="317" w:lineRule="auto" w:before="0" w:after="200"/>
+        <w:spacing w:line="300" w:lineRule="auto" w:before="0" w:after="200"/>
         <w:jc w:val="left"/>
       </w:pPr>
       <w:r>
@@ -25061,7 +25114,7 @@
     </w:p>
     <w:p>
       <w:pPr>
-        <w:spacing w:line="317" w:lineRule="auto" w:before="0" w:after="200"/>
+        <w:spacing w:line="300" w:lineRule="auto" w:before="0" w:after="200"/>
         <w:jc w:val="left"/>
       </w:pPr>
       <w:r>
@@ -25076,7 +25129,7 @@
     </w:p>
     <w:p>
       <w:pPr>
-        <w:spacing w:line="317" w:lineRule="auto" w:before="0" w:after="200"/>
+        <w:spacing w:line="300" w:lineRule="auto" w:before="0" w:after="200"/>
         <w:jc w:val="left"/>
       </w:pPr>
       <w:r>
@@ -25099,7 +25152,7 @@
     </w:p>
     <w:p>
       <w:pPr>
-        <w:spacing w:line="317" w:lineRule="auto" w:before="0" w:after="200"/>
+        <w:spacing w:line="300" w:lineRule="auto" w:before="0" w:after="200"/>
         <w:jc w:val="left"/>
       </w:pPr>
       <w:r>
@@ -25114,7 +25167,7 @@
     </w:p>
     <w:p>
       <w:pPr>
-        <w:spacing w:line="317" w:lineRule="auto" w:before="0" w:after="200"/>
+        <w:spacing w:line="300" w:lineRule="auto" w:before="0" w:after="200"/>
         <w:jc w:val="left"/>
       </w:pPr>
       <w:r>
@@ -25129,7 +25182,7 @@
     </w:p>
     <w:p>
       <w:pPr>
-        <w:spacing w:line="317" w:lineRule="auto" w:before="0" w:after="200"/>
+        <w:spacing w:line="300" w:lineRule="auto" w:before="0" w:after="200"/>
         <w:jc w:val="left"/>
       </w:pPr>
       <w:r>
@@ -25144,7 +25197,7 @@
     </w:p>
     <w:p>
       <w:pPr>
-        <w:spacing w:line="317" w:lineRule="auto" w:before="0" w:after="200"/>
+        <w:spacing w:line="300" w:lineRule="auto" w:before="0" w:after="200"/>
         <w:jc w:val="left"/>
       </w:pPr>
       <w:r>
@@ -25159,7 +25212,7 @@
     </w:p>
     <w:p>
       <w:pPr>
-        <w:spacing w:line="317" w:lineRule="auto" w:before="0" w:after="200"/>
+        <w:spacing w:line="300" w:lineRule="auto" w:before="0" w:after="200"/>
         <w:jc w:val="left"/>
       </w:pPr>
       <w:r>
@@ -25174,7 +25227,7 @@
     </w:p>
     <w:p>
       <w:pPr>
-        <w:spacing w:line="317" w:lineRule="auto" w:before="0" w:after="200"/>
+        <w:spacing w:line="300" w:lineRule="auto" w:before="0" w:after="200"/>
         <w:jc w:val="left"/>
       </w:pPr>
       <w:r>
@@ -25197,7 +25250,7 @@
     </w:p>
     <w:p>
       <w:pPr>
-        <w:spacing w:line="317" w:lineRule="auto" w:before="0" w:after="200"/>
+        <w:spacing w:line="300" w:lineRule="auto" w:before="0" w:after="200"/>
         <w:jc w:val="left"/>
       </w:pPr>
       <w:r>
@@ -25220,7 +25273,7 @@
     </w:p>
     <w:p>
       <w:pPr>
-        <w:spacing w:line="317" w:lineRule="auto" w:before="0" w:after="200"/>
+        <w:spacing w:line="300" w:lineRule="auto" w:before="0" w:after="200"/>
         <w:jc w:val="left"/>
       </w:pPr>
       <w:r>
@@ -25235,7 +25288,7 @@
     </w:p>
     <w:p>
       <w:pPr>
-        <w:spacing w:line="317" w:lineRule="auto" w:before="0" w:after="200"/>
+        <w:spacing w:line="300" w:lineRule="auto" w:before="0" w:after="200"/>
         <w:jc w:val="left"/>
       </w:pPr>
       <w:r>
@@ -25250,7 +25303,7 @@
     </w:p>
     <w:p>
       <w:pPr>
-        <w:spacing w:line="317" w:lineRule="auto" w:before="0" w:after="200"/>
+        <w:spacing w:line="300" w:lineRule="auto" w:before="0" w:after="200"/>
         <w:jc w:val="left"/>
       </w:pPr>
       <w:r>
@@ -25270,7 +25323,7 @@
     </w:p>
     <w:p>
       <w:pPr>
-        <w:spacing w:line="276" w:lineRule="auto" w:before="0" w:after="120"/>
+        <w:spacing w:line="300" w:lineRule="auto" w:before="0" w:after="120"/>
         <w:jc w:val="center"/>
       </w:pPr>
       <w:r>
@@ -25285,13 +25338,13 @@
     </w:p>
     <w:p>
       <w:pPr>
-        <w:spacing w:line="317" w:lineRule="auto" w:before="0" w:after="200"/>
+        <w:spacing w:line="300" w:lineRule="auto" w:before="0" w:after="200"/>
         <w:jc w:val="left"/>
       </w:pPr>
     </w:p>
     <w:p>
       <w:pPr>
-        <w:spacing w:after="0" w:line="317" w:lineRule="auto"/>
+        <w:spacing w:after="0" w:line="300" w:lineRule="auto"/>
         <w:ind w:left="576" w:hanging="576"/>
       </w:pPr>
       <w:r>
@@ -25304,7 +25357,7 @@
     </w:p>
     <w:p>
       <w:pPr>
-        <w:spacing w:after="0" w:line="317" w:lineRule="auto"/>
+        <w:spacing w:after="0" w:line="300" w:lineRule="auto"/>
         <w:ind w:left="576" w:hanging="576"/>
       </w:pPr>
       <w:r>
@@ -25317,7 +25370,7 @@
     </w:p>
     <w:p>
       <w:pPr>
-        <w:spacing w:after="0" w:line="317" w:lineRule="auto"/>
+        <w:spacing w:after="0" w:line="300" w:lineRule="auto"/>
         <w:ind w:left="576" w:hanging="576"/>
       </w:pPr>
       <w:r>
@@ -25330,7 +25383,7 @@
     </w:p>
     <w:p>
       <w:pPr>
-        <w:spacing w:after="0" w:line="317" w:lineRule="auto"/>
+        <w:spacing w:after="0" w:line="300" w:lineRule="auto"/>
         <w:ind w:left="576" w:hanging="576"/>
       </w:pPr>
       <w:r>
@@ -25343,7 +25396,7 @@
     </w:p>
     <w:p>
       <w:pPr>
-        <w:spacing w:after="0" w:line="317" w:lineRule="auto"/>
+        <w:spacing w:after="0" w:line="300" w:lineRule="auto"/>
         <w:ind w:left="576" w:hanging="576"/>
       </w:pPr>
       <w:r>
@@ -25356,7 +25409,7 @@
     </w:p>
     <w:p>
       <w:pPr>
-        <w:spacing w:after="0" w:line="317" w:lineRule="auto"/>
+        <w:spacing w:after="0" w:line="300" w:lineRule="auto"/>
         <w:ind w:left="576" w:hanging="576"/>
       </w:pPr>
       <w:r>
@@ -25369,7 +25422,7 @@
     </w:p>
     <w:p>
       <w:pPr>
-        <w:spacing w:after="0" w:line="317" w:lineRule="auto"/>
+        <w:spacing w:after="0" w:line="300" w:lineRule="auto"/>
         <w:ind w:left="576" w:hanging="576"/>
       </w:pPr>
       <w:r>
@@ -25382,7 +25435,7 @@
     </w:p>
     <w:p>
       <w:pPr>
-        <w:spacing w:after="0" w:line="317" w:lineRule="auto"/>
+        <w:spacing w:after="0" w:line="300" w:lineRule="auto"/>
         <w:ind w:left="576" w:hanging="576"/>
       </w:pPr>
       <w:r>
@@ -25395,7 +25448,7 @@
     </w:p>
     <w:p>
       <w:pPr>
-        <w:spacing w:after="0" w:line="317" w:lineRule="auto"/>
+        <w:spacing w:after="0" w:line="300" w:lineRule="auto"/>
         <w:ind w:left="576" w:hanging="576"/>
       </w:pPr>
       <w:r>
@@ -25408,7 +25461,7 @@
     </w:p>
     <w:p>
       <w:pPr>
-        <w:spacing w:after="0" w:line="317" w:lineRule="auto"/>
+        <w:spacing w:after="0" w:line="300" w:lineRule="auto"/>
         <w:ind w:left="576" w:hanging="576"/>
       </w:pPr>
       <w:r>
@@ -25421,7 +25474,7 @@
     </w:p>
     <w:p>
       <w:pPr>
-        <w:spacing w:after="0" w:line="317" w:lineRule="auto"/>
+        <w:spacing w:after="0" w:line="300" w:lineRule="auto"/>
         <w:ind w:left="576" w:hanging="576"/>
       </w:pPr>
       <w:r>
@@ -25434,7 +25487,7 @@
     </w:p>
     <w:p>
       <w:pPr>
-        <w:spacing w:after="0" w:line="317" w:lineRule="auto"/>
+        <w:spacing w:after="0" w:line="300" w:lineRule="auto"/>
         <w:ind w:left="576" w:hanging="576"/>
       </w:pPr>
       <w:r>
@@ -25447,7 +25500,7 @@
     </w:p>
     <w:p>
       <w:pPr>
-        <w:spacing w:after="0" w:line="317" w:lineRule="auto"/>
+        <w:spacing w:after="0" w:line="300" w:lineRule="auto"/>
         <w:ind w:left="576" w:hanging="576"/>
       </w:pPr>
       <w:r>
@@ -25460,7 +25513,7 @@
     </w:p>
     <w:p>
       <w:pPr>
-        <w:spacing w:after="0" w:line="317" w:lineRule="auto"/>
+        <w:spacing w:after="0" w:line="300" w:lineRule="auto"/>
         <w:ind w:left="576" w:hanging="576"/>
       </w:pPr>
       <w:r>
@@ -25473,7 +25526,7 @@
     </w:p>
     <w:p>
       <w:pPr>
-        <w:spacing w:after="0" w:line="317" w:lineRule="auto"/>
+        <w:spacing w:after="0" w:line="300" w:lineRule="auto"/>
         <w:ind w:left="576" w:hanging="576"/>
       </w:pPr>
       <w:r>
@@ -25486,7 +25539,7 @@
     </w:p>
     <w:p>
       <w:pPr>
-        <w:spacing w:after="0" w:line="317" w:lineRule="auto"/>
+        <w:spacing w:after="0" w:line="300" w:lineRule="auto"/>
         <w:ind w:left="576" w:hanging="576"/>
       </w:pPr>
       <w:r>
@@ -25499,7 +25552,7 @@
     </w:p>
     <w:p>
       <w:pPr>
-        <w:spacing w:after="0" w:line="317" w:lineRule="auto"/>
+        <w:spacing w:after="0" w:line="300" w:lineRule="auto"/>
         <w:ind w:left="576" w:hanging="576"/>
       </w:pPr>
       <w:r>
@@ -25512,7 +25565,7 @@
     </w:p>
     <w:p>
       <w:pPr>
-        <w:spacing w:after="0" w:line="317" w:lineRule="auto"/>
+        <w:spacing w:after="0" w:line="300" w:lineRule="auto"/>
         <w:ind w:left="576" w:hanging="576"/>
       </w:pPr>
       <w:r>
@@ -25525,7 +25578,7 @@
     </w:p>
     <w:p>
       <w:pPr>
-        <w:spacing w:after="0" w:line="317" w:lineRule="auto"/>
+        <w:spacing w:after="0" w:line="300" w:lineRule="auto"/>
         <w:ind w:left="576" w:hanging="576"/>
       </w:pPr>
       <w:r>
@@ -25543,7 +25596,7 @@
     </w:p>
     <w:p>
       <w:pPr>
-        <w:spacing w:line="276" w:lineRule="auto" w:before="0" w:after="120"/>
+        <w:spacing w:line="300" w:lineRule="auto" w:before="0" w:after="120"/>
         <w:jc w:val="center"/>
       </w:pPr>
       <w:r>
@@ -25558,7 +25611,7 @@
     </w:p>
     <w:p>
       <w:pPr>
-        <w:spacing w:line="317" w:lineRule="auto" w:before="0" w:after="200"/>
+        <w:spacing w:line="300" w:lineRule="auto" w:before="0" w:after="200"/>
         <w:jc w:val="left"/>
       </w:pPr>
       <w:r>
@@ -25581,7 +25634,7 @@
     </w:p>
     <w:p>
       <w:pPr>
-        <w:spacing w:line="317" w:lineRule="auto" w:before="0" w:after="200"/>
+        <w:spacing w:line="300" w:lineRule="auto" w:before="0" w:after="200"/>
         <w:jc w:val="left"/>
       </w:pPr>
       <w:r>
@@ -26149,7 +26202,7 @@
     </w:p>
     <w:p>
       <w:pPr>
-        <w:spacing w:line="317" w:lineRule="auto" w:before="0" w:after="200"/>
+        <w:spacing w:line="300" w:lineRule="auto" w:before="0" w:after="200"/>
         <w:jc w:val="left"/>
       </w:pPr>
       <w:r>
@@ -26164,7 +26217,7 @@
     </w:p>
     <w:p>
       <w:pPr>
-        <w:spacing w:line="317" w:lineRule="auto" w:before="0" w:after="200"/>
+        <w:spacing w:line="300" w:lineRule="auto" w:before="0" w:after="200"/>
         <w:jc w:val="left"/>
       </w:pPr>
       <w:r>
@@ -26179,7 +26232,7 @@
     </w:p>
     <w:p>
       <w:pPr>
-        <w:spacing w:line="317" w:lineRule="auto" w:before="0" w:after="200"/>
+        <w:spacing w:line="300" w:lineRule="auto" w:before="0" w:after="200"/>
         <w:jc w:val="left"/>
       </w:pPr>
       <w:r>
@@ -26202,7 +26255,7 @@
     </w:p>
     <w:p>
       <w:pPr>
-        <w:spacing w:line="317" w:lineRule="auto" w:before="0" w:after="200"/>
+        <w:spacing w:line="300" w:lineRule="auto" w:before="0" w:after="200"/>
         <w:jc w:val="left"/>
       </w:pPr>
       <w:r>
@@ -26288,6 +26341,7 @@
     </w:p>
     <w:sectPr>
       <w:headerReference w:type="default" r:id="rId9"/>
+      <w:footerReference w:type="default" r:id="rId16"/>
       <w:pgSz w:w="11909" w:h="16834"/>
       <w:pgMar w:top="1440" w:right="1440" w:bottom="1440" w:left="1440" w:header="720" w:footer="720" w:gutter="0"/>
       <w:cols w:space="720"/>
@@ -26297,6 +26351,28 @@
 </w:document>
 </file>
 
+<file path=word/footer1.xml><?xml version="1.0" encoding="utf-8"?>
+<w:ftr xmlns:m="http://schemas.openxmlformats.org/officeDocument/2006/math" xmlns:mc="http://schemas.openxmlformats.org/markup-compatibility/2006" xmlns:mo="http://schemas.microsoft.com/office/mac/office/2008/main" xmlns:mv="urn:schemas-microsoft-com:mac:vml" xmlns:o="urn:schemas-microsoft-com:office:office" xmlns:r="http://schemas.openxmlformats.org/officeDocument/2006/relationships" xmlns:v="urn:schemas-microsoft-com:vml" xmlns:w10="urn:schemas-microsoft-com:office:word" xmlns:w14="http://schemas.microsoft.com/office/word/2010/wordml" xmlns:w="http://schemas.openxmlformats.org/wordprocessingml/2006/main" xmlns:wne="http://schemas.microsoft.com/office/word/2006/wordml" xmlns:wp14="http://schemas.microsoft.com/office/word/2010/wordprocessingDrawing" xmlns:wp="http://schemas.openxmlformats.org/drawingml/2006/wordprocessingDrawing" xmlns:wpc="http://schemas.microsoft.com/office/word/2010/wordprocessingCanvas" xmlns:wpg="http://schemas.microsoft.com/office/word/2010/wordprocessingGroup" xmlns:wpi="http://schemas.microsoft.com/office/word/2010/wordprocessingInk" xmlns:wps="http://schemas.microsoft.com/office/word/2010/wordprocessingShape" mc:Ignorable="w14 wp14">
+  <w:p>
+    <w:pPr>
+      <w:pStyle w:val="Footer"/>
+      <w:spacing w:line="240" w:lineRule="auto" w:before="0" w:after="0"/>
+      <w:jc w:val="center"/>
+    </w:pPr>
+    <w:r/>
+    <w:r>
+      <w:rPr>
+        <w:rFonts w:ascii="Times New Roman" w:hAnsi="Times New Roman"/>
+        <w:sz w:val="24"/>
+      </w:rPr>
+      <w:fldChar w:fldCharType="begin"/>
+      <w:instrText xml:space="preserve">PAGE</w:instrText>
+      <w:fldChar w:fldCharType="end"/>
+    </w:r>
+  </w:p>
+</w:ftr>
+</file>
+
 <file path=word/header1.xml><?xml version="1.0" encoding="utf-8"?>
 <w:hdr xmlns:m="http://schemas.openxmlformats.org/officeDocument/2006/math" xmlns:mc="http://schemas.openxmlformats.org/markup-compatibility/2006" xmlns:mo="http://schemas.microsoft.com/office/mac/office/2008/main" xmlns:mv="urn:schemas-microsoft-com:mac:vml" xmlns:o="urn:schemas-microsoft-com:office:office" xmlns:r="http://schemas.openxmlformats.org/officeDocument/2006/relationships" xmlns:v="urn:schemas-microsoft-com:vml" xmlns:w10="urn:schemas-microsoft-com:office:word" xmlns:w14="http://schemas.microsoft.com/office/word/2010/wordml" xmlns:w="http://schemas.openxmlformats.org/wordprocessingml/2006/main" xmlns:wne="http://schemas.microsoft.com/office/word/2006/wordml" xmlns:wp14="http://schemas.microsoft.com/office/word/2010/wordprocessingDrawing" xmlns:wp="http://schemas.openxmlformats.org/drawingml/2006/wordprocessingDrawing" xmlns:wpc="http://schemas.microsoft.com/office/word/2010/wordprocessingCanvas" xmlns:wpg="http://schemas.microsoft.com/office/word/2010/wordprocessingGroup" xmlns:wpi="http://schemas.microsoft.com/office/word/2010/wordprocessingInk" xmlns:wps="http://schemas.microsoft.com/office/word/2010/wordprocessingShape" mc:Ignorable="w14 wp14">
   <w:p>
@@ -26304,15 +26380,6 @@
       <w:pStyle w:val="Header"/>
       <w:jc w:val="right"/>
     </w:pPr>
-    <w:r>
-      <w:rPr>
-        <w:rFonts w:ascii="Times New Roman" w:hAnsi="Times New Roman"/>
-        <w:sz w:val="24"/>
-      </w:rPr>
-      <w:fldChar w:fldCharType="begin"/>
-      <w:instrText xml:space="preserve">PAGE</w:instrText>
-      <w:fldChar w:fldCharType="end"/>
-    </w:r>
   </w:p>
 </w:hdr>
 </file>
@@ -26681,7 +26748,7 @@
     <w:qFormat/>
     <w:rsid w:val="00FC693F"/>
     <w:pPr>
-      <w:spacing w:line="317" w:lineRule="auto" w:after="200" w:before="0"/>
+      <w:spacing w:line="300" w:lineRule="auto" w:after="200" w:before="0"/>
     </w:pPr>
     <w:rPr>
       <w:rFonts w:ascii="Times New Roman" w:hAnsi="Times New Roman" w:eastAsia="Times New Roman"/>
@@ -26743,7 +26810,7 @@
     <w:pPr>
       <w:keepNext/>
       <w:keepLines/>
-      <w:spacing w:before="200" w:after="80" w:line="317" w:lineRule="auto"/>
+      <w:spacing w:before="200" w:after="80" w:line="300" w:lineRule="auto"/>
       <w:jc w:val="left"/>
       <w:outlineLvl w:val="0"/>
     </w:pPr>
@@ -26769,7 +26836,7 @@
     <w:pPr>
       <w:keepNext/>
       <w:keepLines/>
-      <w:spacing w:before="200" w:after="80" w:line="317" w:lineRule="auto"/>
+      <w:spacing w:before="200" w:after="80" w:line="300" w:lineRule="auto"/>
       <w:jc w:val="left"/>
       <w:outlineLvl w:val="1"/>
     </w:pPr>
@@ -26795,7 +26862,7 @@
     <w:pPr>
       <w:keepNext/>
       <w:keepLines/>
-      <w:spacing w:before="200" w:after="80" w:line="317" w:lineRule="auto"/>
+      <w:spacing w:before="200" w:after="80" w:line="300" w:lineRule="auto"/>
       <w:jc w:val="left"/>
       <w:outlineLvl w:val="2"/>
     </w:pPr>
@@ -26821,7 +26888,7 @@
     <w:pPr>
       <w:keepNext/>
       <w:keepLines/>
-      <w:spacing w:before="200" w:after="80" w:line="317" w:lineRule="auto"/>
+      <w:spacing w:before="200" w:after="80" w:line="300" w:lineRule="auto"/>
       <w:jc w:val="left"/>
       <w:outlineLvl w:val="3"/>
     </w:pPr>

</xml_diff>